<commit_message>
Add admin dashboard and 1 month support to the NGN 600,000 package
Renames the packages to Essential Website + Admin (NGN 600,000) and
Complete Dynamic Website (NGN 1,200,000) and updates the comparison table.

Co-Authored-By: Claude Opus 5.5 <noreply@anthropic.com>
Claude-Session: https://claude.ai/code/session_014PNLZWwN83EuLNDz48wW94
</commit_message>
<xml_diff>
--- a/deliverables/SulvaTech_Mubil_Foundation_Quotation.docx
+++ b/deliverables/SulvaTech_Mubil_Foundation_Quotation.docx
@@ -722,7 +722,7 @@
           <w:sz w:val="21"/>
           <w:szCs w:val="21"/>
         </w:rPr>
-        <w:t xml:space="preserve">Below are two options: a Static Website for a strong, professional presence today, and a Dynamic Website that the Foundation’s own staff can update every week without calling a developer.</w:t>
+        <w:t xml:space="preserve">Below are two options. Both come with an admin dashboard, so the Foundation’s own staff can keep the website up to date without calling a developer. The Essential Website covers everything needed to present the Foundation professionally; the Complete Website adds donations, memberships, events and newsletters for a Foundation ready to grow online.</w:t>
       </w:r>
     </w:p>
     <w:p>
@@ -1007,7 +1007,7 @@
           <w:sz w:val="28"/>
           <w:szCs w:val="28"/>
         </w:rPr>
-        <w:t xml:space="preserve">Option 1 — Static Website</w:t>
+        <w:t xml:space="preserve">Option 1 — Essential Website + Admin Dashboard</w:t>
       </w:r>
     </w:p>
     <w:p>
@@ -1021,7 +1021,7 @@
           <w:sz w:val="21"/>
           <w:szCs w:val="21"/>
         </w:rPr>
-        <w:t xml:space="preserve">A professional, fast and cost-effective website for presenting the Foundation, its programmes, projects and contact details.</w:t>
+        <w:t xml:space="preserve">A professional, fast and cost-effective website for presenting the Foundation, its programmes, projects and contact details — with its own admin dashboard, so your team can update it from day one.</w:t>
       </w:r>
     </w:p>
     <w:p>
@@ -1191,6 +1191,173 @@
           <w:szCs w:val="21"/>
         </w:rPr>
         <w:t xml:space="preserve">SSL security certificate and fast-loading, secure build</w:t>
+      </w:r>
+    </w:p>
+    <w:p>
+      <w:pPr>
+        <w:keepNext/>
+        <w:spacing w:after="80" w:before="200"/>
+      </w:pPr>
+      <w:r>
+        <w:rPr>
+          <w:rFonts w:ascii="Arial" w:cs="Arial" w:eastAsia="Arial" w:hAnsi="Arial"/>
+          <w:b/>
+          <w:bCs/>
+          <w:color w:val="0F3B36"/>
+          <w:sz w:val="22"/>
+          <w:szCs w:val="22"/>
+        </w:rPr>
+        <w:t xml:space="preserve">Admin dashboard included</w:t>
+      </w:r>
+    </w:p>
+    <w:p>
+      <w:pPr>
+        <w:pStyle w:val="ListParagraph"/>
+        <w:numPr>
+          <w:ilvl w:val="0"/>
+          <w:numId w:val="2"/>
+        </w:numPr>
+        <w:spacing w:after="60" w:line="276"/>
+      </w:pPr>
+      <w:r>
+        <w:rPr>
+          <w:rFonts w:ascii="Arial" w:cs="Arial" w:eastAsia="Arial" w:hAnsi="Arial"/>
+          <w:color w:val="0B0D0C"/>
+          <w:sz w:val="21"/>
+          <w:szCs w:val="21"/>
+        </w:rPr>
+        <w:t xml:space="preserve">Secure admin login for the Foundation</w:t>
+      </w:r>
+    </w:p>
+    <w:p>
+      <w:pPr>
+        <w:pStyle w:val="ListParagraph"/>
+        <w:numPr>
+          <w:ilvl w:val="0"/>
+          <w:numId w:val="2"/>
+        </w:numPr>
+        <w:spacing w:after="60" w:line="276"/>
+      </w:pPr>
+      <w:r>
+        <w:rPr>
+          <w:rFonts w:ascii="Arial" w:cs="Arial" w:eastAsia="Arial" w:hAnsi="Arial"/>
+          <w:color w:val="0B0D0C"/>
+          <w:sz w:val="21"/>
+          <w:szCs w:val="21"/>
+        </w:rPr>
+        <w:t xml:space="preserve">Edit page text and images yourself — no developer needed</w:t>
+      </w:r>
+    </w:p>
+    <w:p>
+      <w:pPr>
+        <w:pStyle w:val="ListParagraph"/>
+        <w:numPr>
+          <w:ilvl w:val="0"/>
+          <w:numId w:val="2"/>
+        </w:numPr>
+        <w:spacing w:after="60" w:line="276"/>
+      </w:pPr>
+      <w:r>
+        <w:rPr>
+          <w:rFonts w:ascii="Arial" w:cs="Arial" w:eastAsia="Arial" w:hAnsi="Arial"/>
+          <w:color w:val="0B0D0C"/>
+          <w:sz w:val="21"/>
+          <w:szCs w:val="21"/>
+        </w:rPr>
+        <w:t xml:space="preserve">Upload and manage gallery photos</w:t>
+      </w:r>
+    </w:p>
+    <w:p>
+      <w:pPr>
+        <w:pStyle w:val="ListParagraph"/>
+        <w:numPr>
+          <w:ilvl w:val="0"/>
+          <w:numId w:val="2"/>
+        </w:numPr>
+        <w:spacing w:after="60" w:line="276"/>
+      </w:pPr>
+      <w:r>
+        <w:rPr>
+          <w:rFonts w:ascii="Arial" w:cs="Arial" w:eastAsia="Arial" w:hAnsi="Arial"/>
+          <w:color w:val="0B0D0C"/>
+          <w:sz w:val="21"/>
+          <w:szCs w:val="21"/>
+        </w:rPr>
+        <w:t xml:space="preserve">Post news and announcements</w:t>
+      </w:r>
+    </w:p>
+    <w:p>
+      <w:pPr>
+        <w:pStyle w:val="ListParagraph"/>
+        <w:numPr>
+          <w:ilvl w:val="0"/>
+          <w:numId w:val="2"/>
+        </w:numPr>
+        <w:spacing w:after="60" w:line="276"/>
+      </w:pPr>
+      <w:r>
+        <w:rPr>
+          <w:rFonts w:ascii="Arial" w:cs="Arial" w:eastAsia="Arial" w:hAnsi="Arial"/>
+          <w:color w:val="0B0D0C"/>
+          <w:sz w:val="21"/>
+          <w:szCs w:val="21"/>
+        </w:rPr>
+        <w:t xml:space="preserve">View and export contact-form messages in one place</w:t>
+      </w:r>
+    </w:p>
+    <w:p>
+      <w:pPr>
+        <w:pStyle w:val="ListParagraph"/>
+        <w:numPr>
+          <w:ilvl w:val="0"/>
+          <w:numId w:val="2"/>
+        </w:numPr>
+        <w:spacing w:after="60" w:line="276"/>
+      </w:pPr>
+      <w:r>
+        <w:rPr>
+          <w:rFonts w:ascii="Arial" w:cs="Arial" w:eastAsia="Arial" w:hAnsi="Arial"/>
+          <w:color w:val="0B0D0C"/>
+          <w:sz w:val="21"/>
+          <w:szCs w:val="21"/>
+        </w:rPr>
+        <w:t xml:space="preserve">Database with scheduled backups</w:t>
+      </w:r>
+    </w:p>
+    <w:p>
+      <w:pPr>
+        <w:pStyle w:val="ListParagraph"/>
+        <w:numPr>
+          <w:ilvl w:val="0"/>
+          <w:numId w:val="2"/>
+        </w:numPr>
+        <w:spacing w:after="60" w:line="276"/>
+      </w:pPr>
+      <w:r>
+        <w:rPr>
+          <w:rFonts w:ascii="Arial" w:cs="Arial" w:eastAsia="Arial" w:hAnsi="Arial"/>
+          <w:color w:val="0B0D0C"/>
+          <w:sz w:val="21"/>
+          <w:szCs w:val="21"/>
+        </w:rPr>
+        <w:t xml:space="preserve">Recorded walkthrough showing your team how to use the dashboard</w:t>
+      </w:r>
+    </w:p>
+    <w:p>
+      <w:pPr>
+        <w:keepNext/>
+        <w:spacing w:after="80" w:before="200"/>
+      </w:pPr>
+      <w:r>
+        <w:rPr>
+          <w:rFonts w:ascii="Arial" w:cs="Arial" w:eastAsia="Arial" w:hAnsi="Arial"/>
+          <w:b/>
+          <w:bCs/>
+          <w:color w:val="0F3B36"/>
+          <w:sz w:val="22"/>
+          <w:szCs w:val="22"/>
+        </w:rPr>
+        <w:t xml:space="preserve">Support</w:t>
       </w:r>
     </w:p>
     <w:p>
@@ -1229,7 +1396,7 @@
           <w:sz w:val="21"/>
           <w:szCs w:val="21"/>
         </w:rPr>
-        <w:t xml:space="preserve">2 weeks of free support after launch</w:t>
+        <w:t xml:space="preserve">1 month of free support after launch</w:t>
       </w:r>
     </w:p>
     <w:p>
@@ -1298,7 +1465,7 @@
                 <w:sz w:val="22"/>
                 <w:szCs w:val="22"/>
               </w:rPr>
-              <w:t xml:space="preserve">Static Website — total</w:t>
+              <w:t xml:space="preserve">Essential Website + Admin — total</w:t>
             </w:r>
           </w:p>
           <w:p>
@@ -1388,7 +1555,7 @@
           <w:sz w:val="28"/>
           <w:szCs w:val="28"/>
         </w:rPr>
-        <w:t xml:space="preserve">Option 2 — Dynamic Website</w:t>
+        <w:t xml:space="preserve">Option 2 — Complete Dynamic Website</w:t>
       </w:r>
     </w:p>
     <w:p>
@@ -1402,7 +1569,7 @@
           <w:sz w:val="21"/>
           <w:szCs w:val="21"/>
         </w:rPr>
-        <w:t xml:space="preserve">A complete, database-driven website the Foundation can manage itself — ideal for an organisation that will regularly publish programmes, projects, news, events, stories, images and appeals for donations.</w:t>
+        <w:t xml:space="preserve">The full platform for a Foundation that will regularly publish programmes, projects, events and stories, take donations online and grow a community of volunteers, members and supporters.</w:t>
       </w:r>
     </w:p>
     <w:p>
@@ -1419,7 +1586,7 @@
           <w:sz w:val="22"/>
           <w:szCs w:val="22"/>
         </w:rPr>
-        <w:t xml:space="preserve">Everything in the Static Website, plus:</w:t>
+        <w:t xml:space="preserve">Everything in the Essential Website, plus:</w:t>
       </w:r>
     </w:p>
     <w:p>
@@ -1438,7 +1605,7 @@
           <w:sz w:val="21"/>
           <w:szCs w:val="21"/>
         </w:rPr>
-        <w:t xml:space="preserve">Content management dashboard (CMS) with secure staff logins</w:t>
+        <w:t xml:space="preserve">Full content management dashboard (CMS) — add, edit and delete any page, section or media</w:t>
       </w:r>
     </w:p>
     <w:p>
@@ -1457,7 +1624,7 @@
           <w:sz w:val="21"/>
           <w:szCs w:val="21"/>
         </w:rPr>
-        <w:t xml:space="preserve">Admin and Editor roles — control who can publish what</w:t>
+        <w:t xml:space="preserve">Multiple staff logins with Admin and Editor roles — control who can publish what</w:t>
       </w:r>
     </w:p>
     <w:p>
@@ -1476,7 +1643,7 @@
           <w:sz w:val="21"/>
           <w:szCs w:val="21"/>
         </w:rPr>
-        <w:t xml:space="preserve">Add, edit and delete any page content, images and media</w:t>
+        <w:t xml:space="preserve">News / blog with categories, featured stories and sharing</w:t>
       </w:r>
     </w:p>
     <w:p>
@@ -1495,7 +1662,7 @@
           <w:sz w:val="21"/>
           <w:szCs w:val="21"/>
         </w:rPr>
-        <w:t xml:space="preserve">News / blog / updates and announcements</w:t>
+        <w:t xml:space="preserve">Programmes &amp; projects management</w:t>
       </w:r>
     </w:p>
     <w:p>
@@ -1514,7 +1681,7 @@
           <w:sz w:val="21"/>
           <w:szCs w:val="21"/>
         </w:rPr>
-        <w:t xml:space="preserve">Programmes &amp; projects management</w:t>
+        <w:t xml:space="preserve">Events management</w:t>
       </w:r>
     </w:p>
     <w:p>
@@ -1533,7 +1700,7 @@
           <w:sz w:val="21"/>
           <w:szCs w:val="21"/>
         </w:rPr>
-        <w:t xml:space="preserve">Events management</w:t>
+        <w:t xml:space="preserve">Donation page with online payments (Paystack or Flutterwave)</w:t>
       </w:r>
     </w:p>
     <w:p>
@@ -1552,7 +1719,7 @@
           <w:sz w:val="21"/>
           <w:szCs w:val="21"/>
         </w:rPr>
-        <w:t xml:space="preserve">Donation page with online payments (Paystack or Flutterwave)</w:t>
+        <w:t xml:space="preserve">Volunteer and membership registration — submissions land in the dashboard</w:t>
       </w:r>
     </w:p>
     <w:p>
@@ -1571,7 +1738,7 @@
           <w:sz w:val="21"/>
           <w:szCs w:val="21"/>
         </w:rPr>
-        <w:t xml:space="preserve">Volunteer and membership registration — submissions land in the dashboard</w:t>
+        <w:t xml:space="preserve">Newsletter sign-ups with an exportable subscriber list</w:t>
       </w:r>
     </w:p>
     <w:p>
@@ -1590,7 +1757,7 @@
           <w:sz w:val="21"/>
           <w:szCs w:val="21"/>
         </w:rPr>
-        <w:t xml:space="preserve">Newsletter sign-ups with an exportable subscriber list</w:t>
+        <w:t xml:space="preserve">Manageable image and media gallery</w:t>
       </w:r>
     </w:p>
     <w:p>
@@ -1609,7 +1776,7 @@
           <w:sz w:val="21"/>
           <w:szCs w:val="21"/>
         </w:rPr>
-        <w:t xml:space="preserve">Manageable image and media gallery</w:t>
+        <w:t xml:space="preserve">Multiple professional email accounts for staff</w:t>
       </w:r>
     </w:p>
     <w:p>
@@ -1628,26 +1795,7 @@
           <w:sz w:val="21"/>
           <w:szCs w:val="21"/>
         </w:rPr>
-        <w:t xml:space="preserve">Multiple professional email accounts for staff</w:t>
-      </w:r>
-    </w:p>
-    <w:p>
-      <w:pPr>
-        <w:pStyle w:val="ListParagraph"/>
-        <w:numPr>
-          <w:ilvl w:val="0"/>
-          <w:numId w:val="2"/>
-        </w:numPr>
-        <w:spacing w:after="60" w:line="276"/>
-      </w:pPr>
-      <w:r>
-        <w:rPr>
-          <w:rFonts w:ascii="Arial" w:cs="Arial" w:eastAsia="Arial" w:hAnsi="Arial"/>
-          <w:color w:val="0B0D0C"/>
-          <w:sz w:val="21"/>
-          <w:szCs w:val="21"/>
-        </w:rPr>
-        <w:t xml:space="preserve">Database with scheduled backups and enhanced security configuration</w:t>
+        <w:t xml:space="preserve">Enhanced security configuration</w:t>
       </w:r>
     </w:p>
     <w:p>
@@ -1774,7 +1922,7 @@
                 <w:sz w:val="22"/>
                 <w:szCs w:val="22"/>
               </w:rPr>
-              <w:t xml:space="preserve">Dynamic Website — total</w:t>
+              <w:t xml:space="preserve">Complete Dynamic Website — total</w:t>
             </w:r>
           </w:p>
           <w:p>
@@ -1955,7 +2103,7 @@
                 <w:sz w:val="19"/>
                 <w:szCs w:val="19"/>
               </w:rPr>
-              <w:t xml:space="preserve">Static</w:t>
+              <w:t xml:space="preserve">Essential</w:t>
             </w:r>
           </w:p>
         </w:tc>
@@ -1991,7 +2139,7 @@
                 <w:sz w:val="19"/>
                 <w:szCs w:val="19"/>
               </w:rPr>
-              <w:t xml:space="preserve">Dynamic</w:t>
+              <w:t xml:space="preserve">Complete</w:t>
             </w:r>
           </w:p>
         </w:tc>
@@ -2799,7 +2947,7 @@
                 <w:sz w:val="19"/>
                 <w:szCs w:val="19"/>
               </w:rPr>
-              <w:t xml:space="preserve">Content dashboard (CMS) with staff logins</w:t>
+              <w:t xml:space="preserve">Admin dashboard — edit pages &amp; images</w:t>
             </w:r>
           </w:p>
         </w:tc>
@@ -2829,13 +2977,13 @@
             <w:r>
               <w:rPr>
                 <w:rFonts w:ascii="Arial" w:cs="Arial" w:eastAsia="Arial" w:hAnsi="Arial"/>
-                <w:b w:val="false"/>
-                <w:bCs w:val="false"/>
-                <w:color w:val="5E615F"/>
-                <w:sz w:val="19"/>
-                <w:szCs w:val="19"/>
-              </w:rPr>
-              <w:t xml:space="preserve">—</w:t>
+                <w:b/>
+                <w:bCs/>
+                <w:color w:val="0F3B36"/>
+                <w:sz w:val="19"/>
+                <w:szCs w:val="19"/>
+              </w:rPr>
+              <w:t xml:space="preserve">✓</w:t>
             </w:r>
           </w:p>
         </w:tc>
@@ -2909,7 +3057,7 @@
                 <w:sz w:val="19"/>
                 <w:szCs w:val="19"/>
               </w:rPr>
-              <w:t xml:space="preserve">News / blog &amp; announcements</w:t>
+              <w:t xml:space="preserve">Gallery management</w:t>
             </w:r>
           </w:p>
         </w:tc>
@@ -2939,13 +3087,13 @@
             <w:r>
               <w:rPr>
                 <w:rFonts w:ascii="Arial" w:cs="Arial" w:eastAsia="Arial" w:hAnsi="Arial"/>
-                <w:b w:val="false"/>
-                <w:bCs w:val="false"/>
-                <w:color w:val="5E615F"/>
-                <w:sz w:val="19"/>
-                <w:szCs w:val="19"/>
-              </w:rPr>
-              <w:t xml:space="preserve">—</w:t>
+                <w:b/>
+                <w:bCs/>
+                <w:color w:val="0F3B36"/>
+                <w:sz w:val="19"/>
+                <w:szCs w:val="19"/>
+              </w:rPr>
+              <w:t xml:space="preserve">✓</w:t>
             </w:r>
           </w:p>
         </w:tc>
@@ -3019,43 +3167,7 @@
                 <w:sz w:val="19"/>
                 <w:szCs w:val="19"/>
               </w:rPr>
-              <w:t xml:space="preserve">Programmes, projects &amp; events management</w:t>
-            </w:r>
-          </w:p>
-        </w:tc>
-        <w:tc>
-          <w:tcPr>
-            <w:tcW w:type="dxa" w:w="2300"/>
-            <w:tcBorders>
-              <w:top w:val="none" w:color="FFFFFF" w:sz="0"/>
-              <w:left w:val="none" w:color="FFFFFF" w:sz="0"/>
-              <w:bottom w:val="single" w:color="DDD7CE" w:sz="4"/>
-              <w:right w:val="none" w:color="FFFFFF" w:sz="0"/>
-            </w:tcBorders>
-            <w:shd w:fill="FFFFFF" w:color="auto" w:val="clear"/>
-            <w:tcMar>
-              <w:top w:type="dxa" w:w="110"/>
-              <w:left w:type="dxa" w:w="160"/>
-              <w:bottom w:type="dxa" w:w="110"/>
-              <w:right w:type="dxa" w:w="160"/>
-            </w:tcMar>
-            <w:vAlign w:val="center"/>
-          </w:tcPr>
-          <w:p>
-            <w:pPr>
-              <w:spacing w:after="0" w:before="0" w:line="288"/>
-              <w:jc w:val="center"/>
-            </w:pPr>
-            <w:r>
-              <w:rPr>
-                <w:rFonts w:ascii="Arial" w:cs="Arial" w:eastAsia="Arial" w:hAnsi="Arial"/>
-                <w:b w:val="false"/>
-                <w:bCs w:val="false"/>
-                <w:color w:val="5E615F"/>
-                <w:sz w:val="19"/>
-                <w:szCs w:val="19"/>
-              </w:rPr>
-              <w:t xml:space="preserve">—</w:t>
+              <w:t xml:space="preserve">News &amp; announcements</w:t>
             </w:r>
           </w:p>
         </w:tc>
@@ -3092,6 +3204,42 @@
                 <w:szCs w:val="19"/>
               </w:rPr>
               <w:t xml:space="preserve">✓</w:t>
+            </w:r>
+          </w:p>
+        </w:tc>
+        <w:tc>
+          <w:tcPr>
+            <w:tcW w:type="dxa" w:w="2300"/>
+            <w:tcBorders>
+              <w:top w:val="none" w:color="FFFFFF" w:sz="0"/>
+              <w:left w:val="none" w:color="FFFFFF" w:sz="0"/>
+              <w:bottom w:val="single" w:color="DDD7CE" w:sz="4"/>
+              <w:right w:val="none" w:color="FFFFFF" w:sz="0"/>
+            </w:tcBorders>
+            <w:shd w:fill="FFFFFF" w:color="auto" w:val="clear"/>
+            <w:tcMar>
+              <w:top w:type="dxa" w:w="110"/>
+              <w:left w:type="dxa" w:w="160"/>
+              <w:bottom w:type="dxa" w:w="110"/>
+              <w:right w:type="dxa" w:w="160"/>
+            </w:tcMar>
+            <w:vAlign w:val="center"/>
+          </w:tcPr>
+          <w:p>
+            <w:pPr>
+              <w:spacing w:after="0" w:before="0" w:line="288"/>
+              <w:jc w:val="center"/>
+            </w:pPr>
+            <w:r>
+              <w:rPr>
+                <w:rFonts w:ascii="Arial" w:cs="Arial" w:eastAsia="Arial" w:hAnsi="Arial"/>
+                <w:b w:val="false"/>
+                <w:bCs w:val="false"/>
+                <w:color w:val="0F3B36"/>
+                <w:sz w:val="19"/>
+                <w:szCs w:val="19"/>
+              </w:rPr>
+              <w:t xml:space="preserve">Full blog</w:t>
             </w:r>
           </w:p>
         </w:tc>
@@ -3129,7 +3277,7 @@
                 <w:sz w:val="19"/>
                 <w:szCs w:val="19"/>
               </w:rPr>
-              <w:t xml:space="preserve">Online donations (Paystack / Flutterwave)</w:t>
+              <w:t xml:space="preserve">Contact messages in the dashboard</w:t>
             </w:r>
           </w:p>
         </w:tc>
@@ -3159,13 +3307,13 @@
             <w:r>
               <w:rPr>
                 <w:rFonts w:ascii="Arial" w:cs="Arial" w:eastAsia="Arial" w:hAnsi="Arial"/>
-                <w:b w:val="false"/>
-                <w:bCs w:val="false"/>
-                <w:color w:val="5E615F"/>
-                <w:sz w:val="19"/>
-                <w:szCs w:val="19"/>
-              </w:rPr>
-              <w:t xml:space="preserve">—</w:t>
+                <w:b/>
+                <w:bCs/>
+                <w:color w:val="0F3B36"/>
+                <w:sz w:val="19"/>
+                <w:szCs w:val="19"/>
+              </w:rPr>
+              <w:t xml:space="preserve">✓</w:t>
             </w:r>
           </w:p>
         </w:tc>
@@ -3239,7 +3387,7 @@
                 <w:sz w:val="19"/>
                 <w:szCs w:val="19"/>
               </w:rPr>
-              <w:t xml:space="preserve">Volunteer &amp; membership registration</w:t>
+              <w:t xml:space="preserve">Database &amp; scheduled backups</w:t>
             </w:r>
           </w:p>
         </w:tc>
@@ -3269,13 +3417,13 @@
             <w:r>
               <w:rPr>
                 <w:rFonts w:ascii="Arial" w:cs="Arial" w:eastAsia="Arial" w:hAnsi="Arial"/>
-                <w:b w:val="false"/>
-                <w:bCs w:val="false"/>
-                <w:color w:val="5E615F"/>
-                <w:sz w:val="19"/>
-                <w:szCs w:val="19"/>
-              </w:rPr>
-              <w:t xml:space="preserve">—</w:t>
+                <w:b/>
+                <w:bCs/>
+                <w:color w:val="0F3B36"/>
+                <w:sz w:val="19"/>
+                <w:szCs w:val="19"/>
+              </w:rPr>
+              <w:t xml:space="preserve">✓</w:t>
             </w:r>
           </w:p>
         </w:tc>
@@ -3349,7 +3497,7 @@
                 <w:sz w:val="19"/>
                 <w:szCs w:val="19"/>
               </w:rPr>
-              <w:t xml:space="preserve">Newsletter sign-ups</w:t>
+              <w:t xml:space="preserve">Staff logins</w:t>
             </w:r>
           </w:p>
         </w:tc>
@@ -3381,11 +3529,11 @@
                 <w:rFonts w:ascii="Arial" w:cs="Arial" w:eastAsia="Arial" w:hAnsi="Arial"/>
                 <w:b w:val="false"/>
                 <w:bCs w:val="false"/>
-                <w:color w:val="5E615F"/>
-                <w:sz w:val="19"/>
-                <w:szCs w:val="19"/>
-              </w:rPr>
-              <w:t xml:space="preserve">—</w:t>
+                <w:color w:val="0F3B36"/>
+                <w:sz w:val="19"/>
+                <w:szCs w:val="19"/>
+              </w:rPr>
+              <w:t xml:space="preserve">1 admin</w:t>
             </w:r>
           </w:p>
         </w:tc>
@@ -3415,13 +3563,13 @@
             <w:r>
               <w:rPr>
                 <w:rFonts w:ascii="Arial" w:cs="Arial" w:eastAsia="Arial" w:hAnsi="Arial"/>
-                <w:b/>
-                <w:bCs/>
+                <w:b w:val="false"/>
+                <w:bCs w:val="false"/>
                 <w:color w:val="0F3B36"/>
                 <w:sz w:val="19"/>
                 <w:szCs w:val="19"/>
               </w:rPr>
-              <w:t xml:space="preserve">✓</w:t>
+              <w:t xml:space="preserve">Admin + Editors</w:t>
             </w:r>
           </w:p>
         </w:tc>
@@ -3459,7 +3607,7 @@
                 <w:sz w:val="19"/>
                 <w:szCs w:val="19"/>
               </w:rPr>
-              <w:t xml:space="preserve">Database &amp; scheduled backups</w:t>
+              <w:t xml:space="preserve">Programmes, projects &amp; events management</w:t>
             </w:r>
           </w:p>
         </w:tc>
@@ -3569,7 +3717,7 @@
                 <w:sz w:val="19"/>
                 <w:szCs w:val="19"/>
               </w:rPr>
-              <w:t xml:space="preserve">Staff training (live + recorded)</w:t>
+              <w:t xml:space="preserve">Online donations (Paystack / Flutterwave)</w:t>
             </w:r>
           </w:p>
         </w:tc>
@@ -3679,7 +3827,7 @@
                 <w:sz w:val="19"/>
                 <w:szCs w:val="19"/>
               </w:rPr>
-              <w:t xml:space="preserve">Design revision rounds</w:t>
+              <w:t xml:space="preserve">Volunteer &amp; membership registration</w:t>
             </w:r>
           </w:p>
         </w:tc>
@@ -3711,47 +3859,47 @@
                 <w:rFonts w:ascii="Arial" w:cs="Arial" w:eastAsia="Arial" w:hAnsi="Arial"/>
                 <w:b w:val="false"/>
                 <w:bCs w:val="false"/>
+                <w:color w:val="5E615F"/>
+                <w:sz w:val="19"/>
+                <w:szCs w:val="19"/>
+              </w:rPr>
+              <w:t xml:space="preserve">—</w:t>
+            </w:r>
+          </w:p>
+        </w:tc>
+        <w:tc>
+          <w:tcPr>
+            <w:tcW w:type="dxa" w:w="2300"/>
+            <w:tcBorders>
+              <w:top w:val="none" w:color="FFFFFF" w:sz="0"/>
+              <w:left w:val="none" w:color="FFFFFF" w:sz="0"/>
+              <w:bottom w:val="single" w:color="DDD7CE" w:sz="4"/>
+              <w:right w:val="none" w:color="FFFFFF" w:sz="0"/>
+            </w:tcBorders>
+            <w:shd w:fill="FFFFFF" w:color="auto" w:val="clear"/>
+            <w:tcMar>
+              <w:top w:type="dxa" w:w="110"/>
+              <w:left w:type="dxa" w:w="160"/>
+              <w:bottom w:type="dxa" w:w="110"/>
+              <w:right w:type="dxa" w:w="160"/>
+            </w:tcMar>
+            <w:vAlign w:val="center"/>
+          </w:tcPr>
+          <w:p>
+            <w:pPr>
+              <w:spacing w:after="0" w:before="0" w:line="288"/>
+              <w:jc w:val="center"/>
+            </w:pPr>
+            <w:r>
+              <w:rPr>
+                <w:rFonts w:ascii="Arial" w:cs="Arial" w:eastAsia="Arial" w:hAnsi="Arial"/>
+                <w:b/>
+                <w:bCs/>
                 <w:color w:val="0F3B36"/>
                 <w:sz w:val="19"/>
                 <w:szCs w:val="19"/>
               </w:rPr>
-              <w:t xml:space="preserve">1</w:t>
-            </w:r>
-          </w:p>
-        </w:tc>
-        <w:tc>
-          <w:tcPr>
-            <w:tcW w:type="dxa" w:w="2300"/>
-            <w:tcBorders>
-              <w:top w:val="none" w:color="FFFFFF" w:sz="0"/>
-              <w:left w:val="none" w:color="FFFFFF" w:sz="0"/>
-              <w:bottom w:val="single" w:color="DDD7CE" w:sz="4"/>
-              <w:right w:val="none" w:color="FFFFFF" w:sz="0"/>
-            </w:tcBorders>
-            <w:shd w:fill="FFFFFF" w:color="auto" w:val="clear"/>
-            <w:tcMar>
-              <w:top w:type="dxa" w:w="110"/>
-              <w:left w:type="dxa" w:w="160"/>
-              <w:bottom w:type="dxa" w:w="110"/>
-              <w:right w:type="dxa" w:w="160"/>
-            </w:tcMar>
-            <w:vAlign w:val="center"/>
-          </w:tcPr>
-          <w:p>
-            <w:pPr>
-              <w:spacing w:after="0" w:before="0" w:line="288"/>
-              <w:jc w:val="center"/>
-            </w:pPr>
-            <w:r>
-              <w:rPr>
-                <w:rFonts w:ascii="Arial" w:cs="Arial" w:eastAsia="Arial" w:hAnsi="Arial"/>
-                <w:b w:val="false"/>
-                <w:bCs w:val="false"/>
-                <w:color w:val="0F3B36"/>
-                <w:sz w:val="19"/>
-                <w:szCs w:val="19"/>
-              </w:rPr>
-              <w:t xml:space="preserve">2</w:t>
+              <w:t xml:space="preserve">✓</w:t>
             </w:r>
           </w:p>
         </w:tc>
@@ -3789,7 +3937,7 @@
                 <w:sz w:val="19"/>
                 <w:szCs w:val="19"/>
               </w:rPr>
-              <w:t xml:space="preserve">Free support after launch</w:t>
+              <w:t xml:space="preserve">Newsletter sign-ups</w:t>
             </w:r>
           </w:p>
         </w:tc>
@@ -3803,6 +3951,116 @@
               <w:right w:val="none" w:color="FFFFFF" w:sz="0"/>
             </w:tcBorders>
             <w:shd w:fill="F4F1EC" w:color="auto" w:val="clear"/>
+            <w:tcMar>
+              <w:top w:type="dxa" w:w="110"/>
+              <w:left w:type="dxa" w:w="160"/>
+              <w:bottom w:type="dxa" w:w="110"/>
+              <w:right w:type="dxa" w:w="160"/>
+            </w:tcMar>
+            <w:vAlign w:val="center"/>
+          </w:tcPr>
+          <w:p>
+            <w:pPr>
+              <w:spacing w:after="0" w:before="0" w:line="288"/>
+              <w:jc w:val="center"/>
+            </w:pPr>
+            <w:r>
+              <w:rPr>
+                <w:rFonts w:ascii="Arial" w:cs="Arial" w:eastAsia="Arial" w:hAnsi="Arial"/>
+                <w:b w:val="false"/>
+                <w:bCs w:val="false"/>
+                <w:color w:val="5E615F"/>
+                <w:sz w:val="19"/>
+                <w:szCs w:val="19"/>
+              </w:rPr>
+              <w:t xml:space="preserve">—</w:t>
+            </w:r>
+          </w:p>
+        </w:tc>
+        <w:tc>
+          <w:tcPr>
+            <w:tcW w:type="dxa" w:w="2300"/>
+            <w:tcBorders>
+              <w:top w:val="none" w:color="FFFFFF" w:sz="0"/>
+              <w:left w:val="none" w:color="FFFFFF" w:sz="0"/>
+              <w:bottom w:val="single" w:color="DDD7CE" w:sz="4"/>
+              <w:right w:val="none" w:color="FFFFFF" w:sz="0"/>
+            </w:tcBorders>
+            <w:shd w:fill="F4F1EC" w:color="auto" w:val="clear"/>
+            <w:tcMar>
+              <w:top w:type="dxa" w:w="110"/>
+              <w:left w:type="dxa" w:w="160"/>
+              <w:bottom w:type="dxa" w:w="110"/>
+              <w:right w:type="dxa" w:w="160"/>
+            </w:tcMar>
+            <w:vAlign w:val="center"/>
+          </w:tcPr>
+          <w:p>
+            <w:pPr>
+              <w:spacing w:after="0" w:before="0" w:line="288"/>
+              <w:jc w:val="center"/>
+            </w:pPr>
+            <w:r>
+              <w:rPr>
+                <w:rFonts w:ascii="Arial" w:cs="Arial" w:eastAsia="Arial" w:hAnsi="Arial"/>
+                <w:b/>
+                <w:bCs/>
+                <w:color w:val="0F3B36"/>
+                <w:sz w:val="19"/>
+                <w:szCs w:val="19"/>
+              </w:rPr>
+              <w:t xml:space="preserve">✓</w:t>
+            </w:r>
+          </w:p>
+        </w:tc>
+      </w:tr>
+      <w:tr>
+        <w:trPr>
+          <w:cantSplit/>
+        </w:trPr>
+        <w:tc>
+          <w:tcPr>
+            <w:tcW w:type="dxa" w:w="5038"/>
+            <w:tcBorders>
+              <w:top w:val="none" w:color="FFFFFF" w:sz="0"/>
+              <w:left w:val="none" w:color="FFFFFF" w:sz="0"/>
+              <w:bottom w:val="single" w:color="DDD7CE" w:sz="4"/>
+              <w:right w:val="none" w:color="FFFFFF" w:sz="0"/>
+            </w:tcBorders>
+            <w:shd w:fill="FFFFFF" w:color="auto" w:val="clear"/>
+            <w:tcMar>
+              <w:top w:type="dxa" w:w="110"/>
+              <w:left w:type="dxa" w:w="160"/>
+              <w:bottom w:type="dxa" w:w="110"/>
+              <w:right w:type="dxa" w:w="160"/>
+            </w:tcMar>
+            <w:vAlign w:val="center"/>
+          </w:tcPr>
+          <w:p>
+            <w:pPr>
+              <w:spacing w:after="0" w:before="0" w:line="288"/>
+            </w:pPr>
+            <w:r>
+              <w:rPr>
+                <w:rFonts w:ascii="Arial" w:cs="Arial" w:eastAsia="Arial" w:hAnsi="Arial"/>
+                <w:color w:val="0B0D0C"/>
+                <w:sz w:val="19"/>
+                <w:szCs w:val="19"/>
+              </w:rPr>
+              <w:t xml:space="preserve">Staff training</w:t>
+            </w:r>
+          </w:p>
+        </w:tc>
+        <w:tc>
+          <w:tcPr>
+            <w:tcW w:type="dxa" w:w="2300"/>
+            <w:tcBorders>
+              <w:top w:val="none" w:color="FFFFFF" w:sz="0"/>
+              <w:left w:val="none" w:color="FFFFFF" w:sz="0"/>
+              <w:bottom w:val="single" w:color="DDD7CE" w:sz="4"/>
+              <w:right w:val="none" w:color="FFFFFF" w:sz="0"/>
+            </w:tcBorders>
+            <w:shd w:fill="FFFFFF" w:color="auto" w:val="clear"/>
             <w:tcMar>
               <w:top w:type="dxa" w:w="110"/>
               <w:left w:type="dxa" w:w="160"/>
@@ -3825,7 +4083,7 @@
                 <w:sz w:val="19"/>
                 <w:szCs w:val="19"/>
               </w:rPr>
-              <w:t xml:space="preserve">2 weeks</w:t>
+              <w:t xml:space="preserve">Recorded</w:t>
             </w:r>
           </w:p>
         </w:tc>
@@ -3838,7 +4096,227 @@
               <w:bottom w:val="single" w:color="DDD7CE" w:sz="4"/>
               <w:right w:val="none" w:color="FFFFFF" w:sz="0"/>
             </w:tcBorders>
+            <w:shd w:fill="FFFFFF" w:color="auto" w:val="clear"/>
+            <w:tcMar>
+              <w:top w:type="dxa" w:w="110"/>
+              <w:left w:type="dxa" w:w="160"/>
+              <w:bottom w:type="dxa" w:w="110"/>
+              <w:right w:type="dxa" w:w="160"/>
+            </w:tcMar>
+            <w:vAlign w:val="center"/>
+          </w:tcPr>
+          <w:p>
+            <w:pPr>
+              <w:spacing w:after="0" w:before="0" w:line="288"/>
+              <w:jc w:val="center"/>
+            </w:pPr>
+            <w:r>
+              <w:rPr>
+                <w:rFonts w:ascii="Arial" w:cs="Arial" w:eastAsia="Arial" w:hAnsi="Arial"/>
+                <w:b w:val="false"/>
+                <w:bCs w:val="false"/>
+                <w:color w:val="0F3B36"/>
+                <w:sz w:val="19"/>
+                <w:szCs w:val="19"/>
+              </w:rPr>
+              <w:t xml:space="preserve">Live + recorded</w:t>
+            </w:r>
+          </w:p>
+        </w:tc>
+      </w:tr>
+      <w:tr>
+        <w:trPr>
+          <w:cantSplit/>
+        </w:trPr>
+        <w:tc>
+          <w:tcPr>
+            <w:tcW w:type="dxa" w:w="5038"/>
+            <w:tcBorders>
+              <w:top w:val="none" w:color="FFFFFF" w:sz="0"/>
+              <w:left w:val="none" w:color="FFFFFF" w:sz="0"/>
+              <w:bottom w:val="single" w:color="DDD7CE" w:sz="4"/>
+              <w:right w:val="none" w:color="FFFFFF" w:sz="0"/>
+            </w:tcBorders>
             <w:shd w:fill="F4F1EC" w:color="auto" w:val="clear"/>
+            <w:tcMar>
+              <w:top w:type="dxa" w:w="110"/>
+              <w:left w:type="dxa" w:w="160"/>
+              <w:bottom w:type="dxa" w:w="110"/>
+              <w:right w:type="dxa" w:w="160"/>
+            </w:tcMar>
+            <w:vAlign w:val="center"/>
+          </w:tcPr>
+          <w:p>
+            <w:pPr>
+              <w:spacing w:after="0" w:before="0" w:line="288"/>
+            </w:pPr>
+            <w:r>
+              <w:rPr>
+                <w:rFonts w:ascii="Arial" w:cs="Arial" w:eastAsia="Arial" w:hAnsi="Arial"/>
+                <w:color w:val="0B0D0C"/>
+                <w:sz w:val="19"/>
+                <w:szCs w:val="19"/>
+              </w:rPr>
+              <w:t xml:space="preserve">Design revision rounds</w:t>
+            </w:r>
+          </w:p>
+        </w:tc>
+        <w:tc>
+          <w:tcPr>
+            <w:tcW w:type="dxa" w:w="2300"/>
+            <w:tcBorders>
+              <w:top w:val="none" w:color="FFFFFF" w:sz="0"/>
+              <w:left w:val="none" w:color="FFFFFF" w:sz="0"/>
+              <w:bottom w:val="single" w:color="DDD7CE" w:sz="4"/>
+              <w:right w:val="none" w:color="FFFFFF" w:sz="0"/>
+            </w:tcBorders>
+            <w:shd w:fill="F4F1EC" w:color="auto" w:val="clear"/>
+            <w:tcMar>
+              <w:top w:type="dxa" w:w="110"/>
+              <w:left w:type="dxa" w:w="160"/>
+              <w:bottom w:type="dxa" w:w="110"/>
+              <w:right w:type="dxa" w:w="160"/>
+            </w:tcMar>
+            <w:vAlign w:val="center"/>
+          </w:tcPr>
+          <w:p>
+            <w:pPr>
+              <w:spacing w:after="0" w:before="0" w:line="288"/>
+              <w:jc w:val="center"/>
+            </w:pPr>
+            <w:r>
+              <w:rPr>
+                <w:rFonts w:ascii="Arial" w:cs="Arial" w:eastAsia="Arial" w:hAnsi="Arial"/>
+                <w:b w:val="false"/>
+                <w:bCs w:val="false"/>
+                <w:color w:val="0F3B36"/>
+                <w:sz w:val="19"/>
+                <w:szCs w:val="19"/>
+              </w:rPr>
+              <w:t xml:space="preserve">1</w:t>
+            </w:r>
+          </w:p>
+        </w:tc>
+        <w:tc>
+          <w:tcPr>
+            <w:tcW w:type="dxa" w:w="2300"/>
+            <w:tcBorders>
+              <w:top w:val="none" w:color="FFFFFF" w:sz="0"/>
+              <w:left w:val="none" w:color="FFFFFF" w:sz="0"/>
+              <w:bottom w:val="single" w:color="DDD7CE" w:sz="4"/>
+              <w:right w:val="none" w:color="FFFFFF" w:sz="0"/>
+            </w:tcBorders>
+            <w:shd w:fill="F4F1EC" w:color="auto" w:val="clear"/>
+            <w:tcMar>
+              <w:top w:type="dxa" w:w="110"/>
+              <w:left w:type="dxa" w:w="160"/>
+              <w:bottom w:type="dxa" w:w="110"/>
+              <w:right w:type="dxa" w:w="160"/>
+            </w:tcMar>
+            <w:vAlign w:val="center"/>
+          </w:tcPr>
+          <w:p>
+            <w:pPr>
+              <w:spacing w:after="0" w:before="0" w:line="288"/>
+              <w:jc w:val="center"/>
+            </w:pPr>
+            <w:r>
+              <w:rPr>
+                <w:rFonts w:ascii="Arial" w:cs="Arial" w:eastAsia="Arial" w:hAnsi="Arial"/>
+                <w:b w:val="false"/>
+                <w:bCs w:val="false"/>
+                <w:color w:val="0F3B36"/>
+                <w:sz w:val="19"/>
+                <w:szCs w:val="19"/>
+              </w:rPr>
+              <w:t xml:space="preserve">2</w:t>
+            </w:r>
+          </w:p>
+        </w:tc>
+      </w:tr>
+      <w:tr>
+        <w:trPr>
+          <w:cantSplit/>
+        </w:trPr>
+        <w:tc>
+          <w:tcPr>
+            <w:tcW w:type="dxa" w:w="5038"/>
+            <w:tcBorders>
+              <w:top w:val="none" w:color="FFFFFF" w:sz="0"/>
+              <w:left w:val="none" w:color="FFFFFF" w:sz="0"/>
+              <w:bottom w:val="single" w:color="DDD7CE" w:sz="4"/>
+              <w:right w:val="none" w:color="FFFFFF" w:sz="0"/>
+            </w:tcBorders>
+            <w:shd w:fill="FFFFFF" w:color="auto" w:val="clear"/>
+            <w:tcMar>
+              <w:top w:type="dxa" w:w="110"/>
+              <w:left w:type="dxa" w:w="160"/>
+              <w:bottom w:type="dxa" w:w="110"/>
+              <w:right w:type="dxa" w:w="160"/>
+            </w:tcMar>
+            <w:vAlign w:val="center"/>
+          </w:tcPr>
+          <w:p>
+            <w:pPr>
+              <w:spacing w:after="0" w:before="0" w:line="288"/>
+            </w:pPr>
+            <w:r>
+              <w:rPr>
+                <w:rFonts w:ascii="Arial" w:cs="Arial" w:eastAsia="Arial" w:hAnsi="Arial"/>
+                <w:color w:val="0B0D0C"/>
+                <w:sz w:val="19"/>
+                <w:szCs w:val="19"/>
+              </w:rPr>
+              <w:t xml:space="preserve">Free support after launch</w:t>
+            </w:r>
+          </w:p>
+        </w:tc>
+        <w:tc>
+          <w:tcPr>
+            <w:tcW w:type="dxa" w:w="2300"/>
+            <w:tcBorders>
+              <w:top w:val="none" w:color="FFFFFF" w:sz="0"/>
+              <w:left w:val="none" w:color="FFFFFF" w:sz="0"/>
+              <w:bottom w:val="single" w:color="DDD7CE" w:sz="4"/>
+              <w:right w:val="none" w:color="FFFFFF" w:sz="0"/>
+            </w:tcBorders>
+            <w:shd w:fill="FFFFFF" w:color="auto" w:val="clear"/>
+            <w:tcMar>
+              <w:top w:type="dxa" w:w="110"/>
+              <w:left w:type="dxa" w:w="160"/>
+              <w:bottom w:type="dxa" w:w="110"/>
+              <w:right w:type="dxa" w:w="160"/>
+            </w:tcMar>
+            <w:vAlign w:val="center"/>
+          </w:tcPr>
+          <w:p>
+            <w:pPr>
+              <w:spacing w:after="0" w:before="0" w:line="288"/>
+              <w:jc w:val="center"/>
+            </w:pPr>
+            <w:r>
+              <w:rPr>
+                <w:rFonts w:ascii="Arial" w:cs="Arial" w:eastAsia="Arial" w:hAnsi="Arial"/>
+                <w:b w:val="false"/>
+                <w:bCs w:val="false"/>
+                <w:color w:val="0F3B36"/>
+                <w:sz w:val="19"/>
+                <w:szCs w:val="19"/>
+              </w:rPr>
+              <w:t xml:space="preserve">1 month</w:t>
+            </w:r>
+          </w:p>
+        </w:tc>
+        <w:tc>
+          <w:tcPr>
+            <w:tcW w:type="dxa" w:w="2300"/>
+            <w:tcBorders>
+              <w:top w:val="none" w:color="FFFFFF" w:sz="0"/>
+              <w:left w:val="none" w:color="FFFFFF" w:sz="0"/>
+              <w:bottom w:val="single" w:color="DDD7CE" w:sz="4"/>
+              <w:right w:val="none" w:color="FFFFFF" w:sz="0"/>
+            </w:tcBorders>
+            <w:shd w:fill="FFFFFF" w:color="auto" w:val="clear"/>
             <w:tcMar>
               <w:top w:type="dxa" w:w="110"/>
               <w:left w:type="dxa" w:w="160"/>
@@ -4156,16 +4634,16 @@
           <w:sz w:val="21"/>
           <w:szCs w:val="21"/>
         </w:rPr>
-        <w:t xml:space="preserve">Static Website:</w:t>
-      </w:r>
-      <w:r>
-        <w:rPr>
-          <w:rFonts w:ascii="Arial" w:cs="Arial" w:eastAsia="Arial" w:hAnsi="Arial"/>
-          <w:color w:val="0B0D0C"/>
-          <w:sz w:val="21"/>
-          <w:szCs w:val="21"/>
-        </w:rPr>
-        <w:t xml:space="preserve"> about 1–2 weeks</w:t>
+        <w:t xml:space="preserve">Essential Website + Admin:</w:t>
+      </w:r>
+      <w:r>
+        <w:rPr>
+          <w:rFonts w:ascii="Arial" w:cs="Arial" w:eastAsia="Arial" w:hAnsi="Arial"/>
+          <w:color w:val="0B0D0C"/>
+          <w:sz w:val="21"/>
+          <w:szCs w:val="21"/>
+        </w:rPr>
+        <w:t xml:space="preserve"> about 2 weeks</w:t>
       </w:r>
     </w:p>
     <w:p>
@@ -4186,7 +4664,7 @@
           <w:sz w:val="21"/>
           <w:szCs w:val="21"/>
         </w:rPr>
-        <w:t xml:space="preserve">Dynamic Website:</w:t>
+        <w:t xml:space="preserve">Complete Dynamic Website:</w:t>
       </w:r>
       <w:r>
         <w:rPr>
@@ -4374,7 +4852,7 @@
                 <w:sz w:val="19"/>
                 <w:szCs w:val="19"/>
               </w:rPr>
-              <w:t xml:space="preserve">Static</w:t>
+              <w:t xml:space="preserve">Essential</w:t>
             </w:r>
           </w:p>
         </w:tc>
@@ -4410,7 +4888,7 @@
                 <w:sz w:val="19"/>
                 <w:szCs w:val="19"/>
               </w:rPr>
-              <w:t xml:space="preserve">Dynamic</w:t>
+              <w:t xml:space="preserve">Complete</w:t>
             </w:r>
           </w:p>
         </w:tc>
@@ -4995,7 +5473,7 @@
                 <w:sz w:val="18"/>
                 <w:szCs w:val="18"/>
               </w:rPr>
-              <w:t xml:space="preserve">☐  Static Website — ₦600,000</w:t>
+              <w:t xml:space="preserve">☐  Essential Website + Admin — ₦600,000</w:t>
             </w:r>
           </w:p>
           <w:p>
@@ -5009,7 +5487,7 @@
                 <w:sz w:val="18"/>
                 <w:szCs w:val="18"/>
               </w:rPr>
-              <w:t xml:space="preserve">☐  Dynamic Website — ₦1,200,000</w:t>
+              <w:t xml:space="preserve">☐  Complete Dynamic Website — ₦1,200,000</w:t>
             </w:r>
           </w:p>
           <w:p>

</xml_diff>